<commit_message>
docs: update Progress Report with W9-W12 timeline and final numbers
</commit_message>
<xml_diff>
--- a/ReasonGuard_Progress_Report.docx
+++ b/ReasonGuard_Progress_Report.docx
@@ -19,22 +19,11 @@
     <w:p/>
     <w:p/>
     <w:p>
-      <w:pPr>
-        <w:rPr>
-          <w:lang w:val="ru-RU"/>
-        </w:rPr>
-      </w:pPr>
       <w:r>
         <w:rPr>
           <w:b/>
         </w:rPr>
-        <w:t xml:space="preserve">Bilalov Ravan </w:t>
-      </w:r>
-      <w:r>
-        <w:rPr>
-          <w:b/>
-        </w:rPr>
-        <w:t>Project Progress Summary</w:t>
+        <w:t>Bilalov Ravan Project Progress Summary</w:t>
       </w:r>
       <w:r>
         <w:rPr>
@@ -610,6 +599,8 @@
         <w:t>The project is now transitioning from prototype validation toward larger-scale evaluation and thesis documentation.</w:t>
       </w:r>
     </w:p>
+    <w:p/>
+    <w:p/>
     <w:sectPr>
       <w:pgSz w:w="12240" w:h="15840"/>
       <w:pgMar w:top="1440" w:right="1800" w:bottom="1440" w:left="1800" w:header="720" w:footer="720" w:gutter="0"/>
@@ -775,7 +766,7 @@
   <w:abstractNum w:abstractNumId="8" w15:restartNumberingAfterBreak="0">
     <w:nsid w:val="FFFFFF89"/>
     <w:multiLevelType w:val="singleLevel"/>
-    <w:tmpl w:val="29761A62"/>
+    <w:tmpl w:val="87D8FA3A"/>
     <w:lvl w:ilvl="0">
       <w:start w:val="1"/>
       <w:numFmt w:val="bullet"/>

</xml_diff>